<commit_message>
Deliverable A: mark base paper, use group voice
</commit_message>
<xml_diff>
--- a/docs/deliverables/Deliverable_A_Literature_Review.docx
+++ b/docs/deliverables/Deliverable_A_Literature_Review.docx
@@ -214,7 +214,7 @@
           <w:bCs/>
           <w:color w:val="000000"/>
         </w:rPr>
-        <w:t xml:space="preserve">  ★ RECOMMENDED BASE PAPER</w:t>
+        <w:t xml:space="preserve">  ★ BASE PAPER</w:t>
       </w:r>
     </w:p>
     <w:p>
@@ -335,7 +335,7 @@
           <w:rFonts w:ascii="Times New Roman" w:hAnsi="Times New Roman" w:eastAsia="Times New Roman" w:cs="Times New Roman"/>
           <w:color w:val="000000"/>
         </w:rPr>
-        <w:t xml:space="preserve">The authors state the environment has no access control, security layer, or audit logging and is explicitly not production-ready. I also note that scoring is binary task success with no severity weighting for harmful actions, that no tool-augmented or multi-agent baselines are tested, and that all patient data come from a single US academic hospital model.</w:t>
+        <w:t>The authors state the environment has no access control, security layer, or audit logging and is explicitly not production-ready. We also note that scoring is binary task success with no severity weighting for harmful actions, that no tool-augmented or multi-agent baselines are tested, and that all patient data come from a single US academic hospital model.</w:t>
       </w:r>
     </w:p>
     <w:p>
@@ -1434,7 +1434,7 @@
           <w:rFonts w:ascii="Times New Roman" w:hAnsi="Times New Roman" w:eastAsia="Times New Roman" w:cs="Times New Roman"/>
           <w:color w:val="000000"/>
         </w:rPr>
-        <w:t xml:space="preserve">The authors note licensing cost and uncertain generalizability; I also note the study used only two readers at one German center, tested audio input alone without any accompanying images, relied on cloud-based models that raise data-protection concerns, and did not test accented or non-English speech.</w:t>
+        <w:t>The authors note licensing cost and uncertain generalizability; we also note the study used only two readers at one German center, tested audio input alone without any accompanying images, relied on cloud-based models that raise data-protection concerns, and did not test accented or non-English speech.</w:t>
       </w:r>
     </w:p>
     <w:p>

</xml_diff>

<commit_message>
Deliverable A: add base paper ranking note
</commit_message>
<xml_diff>
--- a/docs/deliverables/Deliverable_A_Literature_Review.docx
+++ b/docs/deliverables/Deliverable_A_Literature_Review.docx
@@ -231,6 +231,29 @@
           <w:color w:val="000000"/>
         </w:rPr>
         <w:t xml:space="preserve">Jiang Y, Black KC, Geng G, Park D, Zou J, Ng AY, Chen JH. NEJM AI, 2(9): AIdbp2500144, 2025. DOI: 10.1056/AIdbp2500144.</w:t>
+      </w:r>
+    </w:p>
+    <w:p>
+      <w:pPr>
+        <w:spacing w:after="120"/>
+      </w:pPr>
+      <w:r>
+        <w:rPr>
+          <w:rFonts w:ascii="Times New Roman" w:hAnsi="Times New Roman" w:eastAsia="Times New Roman" w:cs="Times New Roman"/>
+          <w:b/>
+          <w:color w:val="000000"/>
+          <w:sz w:val="24"/>
+        </w:rPr>
+        <w:t xml:space="preserve">Ranking note: </w:t>
+      </w:r>
+      <w:r>
+        <w:rPr>
+          <w:rFonts w:ascii="Times New Roman" w:hAnsi="Times New Roman" w:eastAsia="Times New Roman" w:cs="Times New Roman"/>
+          <w:b w:val="0"/>
+          <w:color w:val="000000"/>
+          <w:sz w:val="24"/>
+        </w:rPr>
+        <w:t>NEJM AI (Massachusetts Medical Society, launched 2024) is too new to appear in SCImago/Scopus or to have a JCR quartile yet. Eligibility of MedAgentBench as the base paper is being confirmed with our supervisor.</w:t>
       </w:r>
     </w:p>
     <w:p>

</xml_diff>